<commit_message>
Update spoken-presentation script to match redesigned slides
- Agenda: narrate the new polymer-chain visual (six bonded hexagon rings).
- Workshop QC: walk through the six-instrument dashboard with tools and
  units (density cup, Stormer KU, coverage, Hegman wedge, color swatches,
  drying timer).
- Lab QC: describe the specimen panel + 60-degree gloss measure and the
  five duration bars, ending with TCVN/ASTM acceptance.
- Fix stale "35 slide" note on the title block (deck has 37).

Co-Authored-By: Claude Opus 4.8 <noreply@anthropic.com>
Claude-Session: https://claude.ai/code/session_01PbbxSyJEYscgmQfTL8vaUX
</commit_message>
<xml_diff>
--- a/SuHeo/Kịch bản thuyết trình 1 người (37 slide).docx
+++ b/SuHeo/Kịch bản thuyết trình 1 người (37 slide).docx
@@ -35,7 +35,7 @@
           <w:i/>
           <w:sz w:val="22"/>
         </w:rPr>
-        <w:t>Bản dành cho 1 người trình bày · 35 slide · Nhóm 8 · Lớp DHHO18A–D</w:t>
+        <w:t>Bản dành cho 1 người trình bày · 37 slide · Nhóm 8 · Lớp DHHO18A–D</w:t>
       </w:r>
     </w:p>
     <w:p/>
@@ -123,7 +123,7 @@
         <w:rPr>
           <w:i w:val="0"/>
         </w:rPr>
-        <w:t>Trước tiên, em xin giới thiệu bố cục. Báo cáo gồm sáu phần.</w:t>
+        <w:t>Trước tiên, em xin giới thiệu bố cục. Trên màn hình là một chuỗi sáu vòng lục giác nối với nhau như một mạch polymer — mỗi vòng tượng trưng cho một phần của báo cáo.</w:t>
       </w:r>
     </w:p>
     <w:p>
@@ -145,7 +145,7 @@
         <w:rPr>
           <w:i w:val="0"/>
         </w:rPr>
-        <w:t>Bây giờ em xin đi vào phần đầu tiên.</w:t>
+        <w:t>Bây giờ em xin đi vào vòng thứ nhất — phần đầu tiên.</w:t>
       </w:r>
     </w:p>
     <w:p>
@@ -684,7 +684,29 @@
         <w:rPr>
           <w:i w:val="0"/>
         </w:rPr>
-        <w:t>Ở cấp thứ nhất, kiểm tra nhanh tại xưởng dùng các dụng cụ đo cầm tay để theo dõi từng mẻ và quyết định cho qua công đoạn. Các chỉ tiêu gồm: tỷ trọng, màu sắc, độ phủ, độ mịn Hegman, thời gian khô, và độ nhớt đo bằng nhớt kế Stormer.</w:t>
+        <w:t>Ở cấp thứ nhất, kiểm tra nhanh tại xưởng dùng các dụng cụ đo cầm tay để theo dõi từng mẻ và quyết định cho qua công đoạn. Trên màn hình là bảng sáu chỉ tiêu, mỗi chỉ tiêu một dụng cụ đo riêng.</w:t>
+      </w:r>
+    </w:p>
+    <w:p>
+      <w:pPr>
+        <w:spacing w:after="160"/>
+      </w:pPr>
+      <w:r>
+        <w:rPr>
+          <w:i w:val="0"/>
+        </w:rPr>
+        <w:t>[Bấm] Hàng trên: tỷ trọng đo bằng cốc tỷ trọng, tính theo gam trên xăng-ti-mét khối; độ nhớt đo bằng nhớt kế Stormer, đơn vị KU; và độ phủ đo bằng thước độ phủ, tính theo mét vuông trên lít. Hàng dưới: độ mịn đọc trên thước nêm Hegman theo micromet; màu sắc so với dải màu chuẩn; và thời gian khô theo dõi bằng bấm giờ.</w:t>
+      </w:r>
+    </w:p>
+    <w:p>
+      <w:pPr>
+        <w:spacing w:after="160"/>
+      </w:pPr>
+      <w:r>
+        <w:rPr>
+          <w:i w:val="0"/>
+        </w:rPr>
+        <w:t>Mẻ nào đạt đủ sáu chỉ tiêu thì mới được cho qua công đoạn tiếp theo.</w:t>
       </w:r>
     </w:p>
     <w:p>
@@ -706,7 +728,29 @@
         <w:rPr>
           <w:i w:val="0"/>
         </w:rPr>
-        <w:t>Ở cấp thứ hai, kiểm tra sâu tại phòng lab đánh giá độ bền dài hạn của màng sơn, làm cơ sở nghiệm thu. Bao gồm: độ bám dính Pull-off, độ bền uốn và va đập, độ bóng và hàm lượng rắn, phun sương muối, lão hóa UV hoặc QUV, và đối chiếu theo tiêu chuẩn TCVN, ASTM.</w:t>
+        <w:t>Ở cấp thứ hai, kiểm tra sâu tại phòng lab đánh giá độ bền dài hạn của màng sơn, làm cơ sở nghiệm thu. Bên trái màn hình là mẫu thử — một panel thép phủ đủ các lớp sơn, kèm phép đo độ bóng ở góc sáu mươi độ.</w:t>
+      </w:r>
+    </w:p>
+    <w:p>
+      <w:pPr>
+        <w:spacing w:after="160"/>
+      </w:pPr>
+      <w:r>
+        <w:rPr>
+          <w:i w:val="0"/>
+        </w:rPr>
+        <w:t>[Bấm] Bên phải là năm phép thử chính, với thanh dài ngắn thể hiện thời lượng và mức độ khắc nghiệt tương đối: độ bám dính Pull-off theo ISO 4624; độ bền uốn và va đập; độ bóng và hàm lượng rắn; phun sương muối — phép thử dài nhất, kéo dài đến một nghìn giờ; và lão hóa UV trong buồng QUV.</w:t>
+      </w:r>
+    </w:p>
+    <w:p>
+      <w:pPr>
+        <w:spacing w:after="160"/>
+      </w:pPr>
+      <w:r>
+        <w:rPr>
+          <w:i w:val="0"/>
+        </w:rPr>
+        <w:t>Kết quả các phép thử này được đối chiếu với tiêu chuẩn TCVN và ASTM để nghiệm thu lô sản phẩm.</w:t>
       </w:r>
     </w:p>
     <w:p>

</xml_diff>